<commit_message>
feat(tesoreria): update moratorios column mapping and add COSTOS_FIJOS aggregation for Colombia
- Update moratorios columns from PAR 30/60/90/120 to PAR 60/61 with Tasa corriente/Tasa restante
- Add COSTOS_FIJOS concept type that aggregates: 4X1000, Fondo Garantías, IVA Fondo, Servicio Originación, Servicio Giro, Costos Adicionales
- Update condonación columns to match new PAR 60/61 structure
- Add debug logging for moratorios calculation

🤖 Generated with [Claude Code](https://claude.com/claude-code)

Co-Authored-By: Claude <noreply@anthropic.com>
</commit_message>
<xml_diff>
--- a/backend/templates/FK COL - K Marco - Otrosí No. 1.docx
+++ b/backend/templates/FK COL - K Marco - Otrosí No. 1.docx
@@ -1,6 +1,6 @@
 
 <file path=word/document.xml><?xml version="1.0" encoding="utf-8"?>
-<w:document xmlns:wpc="http://schemas.microsoft.com/office/word/2010/wordprocessingCanvas" xmlns:cx="http://schemas.microsoft.com/office/drawing/2014/chartex" xmlns:cx1="http://schemas.microsoft.com/office/drawing/2015/9/8/chartex" xmlns:cx2="http://schemas.microsoft.com/office/drawing/2015/10/21/chartex" xmlns:cx3="http://schemas.microsoft.com/office/drawing/2016/5/9/chartex" xmlns:cx4="http://schemas.microsoft.com/office/drawing/2016/5/10/chartex" xmlns:cx5="http://schemas.microsoft.com/office/drawing/2016/5/11/chartex" xmlns:cx6="http://schemas.microsoft.com/office/drawing/2016/5/12/chartex" xmlns:cx7="http://schemas.microsoft.com/office/drawing/2016/5/13/chartex" xmlns:cx8="http://schemas.microsoft.com/office/drawing/2016/5/14/chartex" xmlns:mc="http://schemas.openxmlformats.org/markup-compatibility/2006" xmlns:aink="http://schemas.microsoft.com/office/drawing/2016/ink" xmlns:am3d="http://schemas.microsoft.com/office/drawing/2017/model3d" xmlns:o="urn:schemas-microsoft-com:office:office" xmlns:oel="http://schemas.microsoft.com/office/2019/extlst" xmlns:r="http://schemas.openxmlformats.org/officeDocument/2006/relationships" xmlns:m="http://schemas.openxmlformats.org/officeDocument/2006/math" xmlns:v="urn:schemas-microsoft-com:vml" xmlns:wp14="http://schemas.microsoft.com/office/word/2010/wordprocessingDrawing" xmlns:wp="http://schemas.openxmlformats.org/drawingml/2006/wordprocessingDrawing" xmlns:w10="urn:schemas-microsoft-com:office:word" xmlns:w="http://schemas.openxmlformats.org/wordprocessingml/2006/main" xmlns:w14="http://schemas.microsoft.com/office/word/2010/wordml" xmlns:w15="http://schemas.microsoft.com/office/word/2012/wordml" xmlns:w16cex="http://schemas.microsoft.com/office/word/2018/wordml/cex" xmlns:w16cid="http://schemas.microsoft.com/office/word/2016/wordml/cid" xmlns:w16="http://schemas.microsoft.com/office/word/2018/wordml" xmlns:w16du="http://schemas.microsoft.com/office/word/2023/wordml/word16du" xmlns:w16sdtdh="http://schemas.microsoft.com/office/word/2020/wordml/sdtdatahash" xmlns:w16sdtfl="http://schemas.microsoft.com/office/word/2024/wordml/sdtformatlock" xmlns:w16se="http://schemas.microsoft.com/office/word/2015/wordml/symex" xmlns:wpg="http://schemas.microsoft.com/office/word/2010/wordprocessingGroup" xmlns:wpi="http://schemas.microsoft.com/office/word/2010/wordprocessingInk" xmlns:wne="http://schemas.microsoft.com/office/word/2006/wordml" xmlns:wps="http://schemas.microsoft.com/office/word/2010/wordprocessingShape" mc:Ignorable="w14 w15 w16se w16cid w16 w16cex w16sdtdh w16sdtfl w16du wp14">
+<w:document xmlns:wpc="http://schemas.microsoft.com/office/word/2010/wordprocessingCanvas" xmlns:cx="http://schemas.microsoft.com/office/drawing/2014/chartex" xmlns:cx1="http://schemas.microsoft.com/office/drawing/2015/9/8/chartex" xmlns:cx2="http://schemas.microsoft.com/office/drawing/2015/10/21/chartex" xmlns:cx3="http://schemas.microsoft.com/office/drawing/2016/5/9/chartex" xmlns:cx4="http://schemas.microsoft.com/office/drawing/2016/5/10/chartex" xmlns:cx5="http://schemas.microsoft.com/office/drawing/2016/5/11/chartex" xmlns:cx6="http://schemas.microsoft.com/office/drawing/2016/5/12/chartex" xmlns:cx7="http://schemas.microsoft.com/office/drawing/2016/5/13/chartex" xmlns:cx8="http://schemas.microsoft.com/office/drawing/2016/5/14/chartex" xmlns:mc="http://schemas.openxmlformats.org/markup-compatibility/2006" xmlns:aink="http://schemas.microsoft.com/office/drawing/2016/ink" xmlns:am3d="http://schemas.microsoft.com/office/drawing/2017/model3d" xmlns:o="urn:schemas-microsoft-com:office:office" xmlns:r="http://schemas.openxmlformats.org/officeDocument/2006/relationships" xmlns:m="http://schemas.openxmlformats.org/officeDocument/2006/math" xmlns:v="urn:schemas-microsoft-com:vml" xmlns:wp14="http://schemas.microsoft.com/office/word/2010/wordprocessingDrawing" xmlns:wp="http://schemas.openxmlformats.org/drawingml/2006/wordprocessingDrawing" xmlns:w10="urn:schemas-microsoft-com:office:word" xmlns:w="http://schemas.openxmlformats.org/wordprocessingml/2006/main" xmlns:w14="http://schemas.microsoft.com/office/word/2010/wordml" xmlns:w15="http://schemas.microsoft.com/office/word/2012/wordml" xmlns:w16cex="http://schemas.microsoft.com/office/word/2018/wordml/cex" xmlns:w16cid="http://schemas.microsoft.com/office/word/2016/wordml/cid" xmlns:w16="http://schemas.microsoft.com/office/word/2018/wordml" xmlns:w16se="http://schemas.microsoft.com/office/word/2015/wordml/symex" xmlns:wpg="http://schemas.microsoft.com/office/word/2010/wordprocessingGroup" xmlns:wpi="http://schemas.microsoft.com/office/word/2010/wordprocessingInk" xmlns:wne="http://schemas.microsoft.com/office/word/2006/wordml" xmlns:wps="http://schemas.microsoft.com/office/word/2010/wordprocessingShape" mc:Ignorable="w14 w15 w16se w16cid w16 w16cex wp14">
   <w:body>
     <w:p>
       <w:pPr>
@@ -1525,31 +1525,7 @@
           <w:szCs w:val="20"/>
           <w:lang w:val="es-CO"/>
         </w:rPr>
-        <w:t xml:space="preserve"> significa la tasa de cambio de Pesos a </w:t>
-      </w:r>
-      <w:proofErr w:type="gramStart"/>
-      <w:r>
-        <w:rPr>
-          <w:rFonts w:ascii="Open Sans" w:hAnsi="Open Sans" w:cs="Open Sans"/>
-          <w:i/>
-          <w:iCs/>
-          <w:sz w:val="20"/>
-          <w:szCs w:val="20"/>
-          <w:lang w:val="es-CO"/>
-        </w:rPr>
-        <w:t>Dólares</w:t>
-      </w:r>
-      <w:proofErr w:type="gramEnd"/>
-      <w:r>
-        <w:rPr>
-          <w:rFonts w:ascii="Open Sans" w:hAnsi="Open Sans" w:cs="Open Sans"/>
-          <w:i/>
-          <w:iCs/>
-          <w:sz w:val="20"/>
-          <w:szCs w:val="20"/>
-          <w:lang w:val="es-CO"/>
-        </w:rPr>
-        <w:t xml:space="preserve"> informada por las Compañías </w:t>
+        <w:t xml:space="preserve"> significa la tasa de cambio de Pesos a Dólares informada por las Compañías </w:t>
       </w:r>
       <w:proofErr w:type="spellStart"/>
       <w:r>
@@ -1597,55 +1573,7 @@
           <w:szCs w:val="20"/>
           <w:lang w:val="es-CO"/>
         </w:rPr>
-        <w:t xml:space="preserve">, la cual no podrá superar en ningún momento a la TRM vigente a cada Fecha de Pago y/o la Fecha de Vencimiento, según corresponda, en quinientos </w:t>
-      </w:r>
-      <w:proofErr w:type="gramStart"/>
-      <w:r>
-        <w:rPr>
-          <w:rFonts w:ascii="Open Sans" w:hAnsi="Open Sans" w:cs="Open Sans"/>
-          <w:i/>
-          <w:iCs/>
-          <w:sz w:val="20"/>
-          <w:szCs w:val="20"/>
-          <w:lang w:val="es-CO"/>
-        </w:rPr>
-        <w:t>Pesos</w:t>
-      </w:r>
-      <w:proofErr w:type="gramEnd"/>
-      <w:r>
-        <w:rPr>
-          <w:rFonts w:ascii="Open Sans" w:hAnsi="Open Sans" w:cs="Open Sans"/>
-          <w:i/>
-          <w:iCs/>
-          <w:sz w:val="20"/>
-          <w:szCs w:val="20"/>
-          <w:lang w:val="es-CO"/>
-        </w:rPr>
-        <w:t xml:space="preserve"> (COP$500) por </w:t>
-      </w:r>
-      <w:proofErr w:type="gramStart"/>
-      <w:r>
-        <w:rPr>
-          <w:rFonts w:ascii="Open Sans" w:hAnsi="Open Sans" w:cs="Open Sans"/>
-          <w:i/>
-          <w:iCs/>
-          <w:sz w:val="20"/>
-          <w:szCs w:val="20"/>
-          <w:lang w:val="es-CO"/>
-        </w:rPr>
-        <w:t>Dólar</w:t>
-      </w:r>
-      <w:proofErr w:type="gramEnd"/>
-      <w:r>
-        <w:rPr>
-          <w:rFonts w:ascii="Open Sans" w:hAnsi="Open Sans" w:cs="Open Sans"/>
-          <w:i/>
-          <w:iCs/>
-          <w:sz w:val="20"/>
-          <w:szCs w:val="20"/>
-          <w:lang w:val="es-CO"/>
-        </w:rPr>
-        <w:t>.</w:t>
+        <w:t>, la cual no podrá superar en ningún momento a la TRM vigente a cada Fecha de Pago y/o la Fecha de Vencimiento, según corresponda, en quinientos Pesos (COP$500) por Dólar.</w:t>
       </w:r>
       <w:r>
         <w:rPr>
@@ -4743,6 +4671,20 @@
           <w:lang w:val="es-CO"/>
         </w:rPr>
       </w:pPr>
+    </w:p>
+    <w:p>
+      <w:pPr>
+        <w:spacing w:after="200"/>
+        <w:ind w:firstLine="1418"/>
+        <w:jc w:val="both"/>
+        <w:rPr>
+          <w:rFonts w:ascii="Open Sans" w:hAnsi="Open Sans" w:cs="Open Sans"/>
+          <w:sz w:val="20"/>
+          <w:szCs w:val="20"/>
+          <w:u w:val="single"/>
+          <w:lang w:val="es-CO"/>
+        </w:rPr>
+      </w:pPr>
       <w:r>
         <w:rPr>
           <w:rFonts w:ascii="Open Sans" w:hAnsi="Open Sans" w:cs="Open Sans"/>
@@ -4779,7 +4721,7 @@
 </file>
 
 <file path=word/endnotes.xml><?xml version="1.0" encoding="utf-8"?>
-<w:endnotes xmlns:wpc="http://schemas.microsoft.com/office/word/2010/wordprocessingCanvas" xmlns:cx="http://schemas.microsoft.com/office/drawing/2014/chartex" xmlns:cx1="http://schemas.microsoft.com/office/drawing/2015/9/8/chartex" xmlns:cx2="http://schemas.microsoft.com/office/drawing/2015/10/21/chartex" xmlns:cx3="http://schemas.microsoft.com/office/drawing/2016/5/9/chartex" xmlns:cx4="http://schemas.microsoft.com/office/drawing/2016/5/10/chartex" xmlns:cx5="http://schemas.microsoft.com/office/drawing/2016/5/11/chartex" xmlns:cx6="http://schemas.microsoft.com/office/drawing/2016/5/12/chartex" xmlns:cx7="http://schemas.microsoft.com/office/drawing/2016/5/13/chartex" xmlns:cx8="http://schemas.microsoft.com/office/drawing/2016/5/14/chartex" xmlns:mc="http://schemas.openxmlformats.org/markup-compatibility/2006" xmlns:aink="http://schemas.microsoft.com/office/drawing/2016/ink" xmlns:am3d="http://schemas.microsoft.com/office/drawing/2017/model3d" xmlns:o="urn:schemas-microsoft-com:office:office" xmlns:oel="http://schemas.microsoft.com/office/2019/extlst" xmlns:r="http://schemas.openxmlformats.org/officeDocument/2006/relationships" xmlns:m="http://schemas.openxmlformats.org/officeDocument/2006/math" xmlns:v="urn:schemas-microsoft-com:vml" xmlns:wp14="http://schemas.microsoft.com/office/word/2010/wordprocessingDrawing" xmlns:wp="http://schemas.openxmlformats.org/drawingml/2006/wordprocessingDrawing" xmlns:w10="urn:schemas-microsoft-com:office:word" xmlns:w="http://schemas.openxmlformats.org/wordprocessingml/2006/main" xmlns:w14="http://schemas.microsoft.com/office/word/2010/wordml" xmlns:w15="http://schemas.microsoft.com/office/word/2012/wordml" xmlns:w16cex="http://schemas.microsoft.com/office/word/2018/wordml/cex" xmlns:w16cid="http://schemas.microsoft.com/office/word/2016/wordml/cid" xmlns:w16="http://schemas.microsoft.com/office/word/2018/wordml" xmlns:w16du="http://schemas.microsoft.com/office/word/2023/wordml/word16du" xmlns:w16sdtdh="http://schemas.microsoft.com/office/word/2020/wordml/sdtdatahash" xmlns:w16sdtfl="http://schemas.microsoft.com/office/word/2024/wordml/sdtformatlock" xmlns:w16se="http://schemas.microsoft.com/office/word/2015/wordml/symex" xmlns:wpg="http://schemas.microsoft.com/office/word/2010/wordprocessingGroup" xmlns:wpi="http://schemas.microsoft.com/office/word/2010/wordprocessingInk" xmlns:wne="http://schemas.microsoft.com/office/word/2006/wordml" xmlns:wps="http://schemas.microsoft.com/office/word/2010/wordprocessingShape" mc:Ignorable="w14 w15 w16se w16cid w16 w16cex w16sdtdh w16sdtfl w16du wp14">
+<w:endnotes xmlns:wpc="http://schemas.microsoft.com/office/word/2010/wordprocessingCanvas" xmlns:cx="http://schemas.microsoft.com/office/drawing/2014/chartex" xmlns:cx1="http://schemas.microsoft.com/office/drawing/2015/9/8/chartex" xmlns:cx2="http://schemas.microsoft.com/office/drawing/2015/10/21/chartex" xmlns:cx3="http://schemas.microsoft.com/office/drawing/2016/5/9/chartex" xmlns:cx4="http://schemas.microsoft.com/office/drawing/2016/5/10/chartex" xmlns:cx5="http://schemas.microsoft.com/office/drawing/2016/5/11/chartex" xmlns:cx6="http://schemas.microsoft.com/office/drawing/2016/5/12/chartex" xmlns:cx7="http://schemas.microsoft.com/office/drawing/2016/5/13/chartex" xmlns:cx8="http://schemas.microsoft.com/office/drawing/2016/5/14/chartex" xmlns:mc="http://schemas.openxmlformats.org/markup-compatibility/2006" xmlns:aink="http://schemas.microsoft.com/office/drawing/2016/ink" xmlns:am3d="http://schemas.microsoft.com/office/drawing/2017/model3d" xmlns:o="urn:schemas-microsoft-com:office:office" xmlns:r="http://schemas.openxmlformats.org/officeDocument/2006/relationships" xmlns:m="http://schemas.openxmlformats.org/officeDocument/2006/math" xmlns:v="urn:schemas-microsoft-com:vml" xmlns:wp14="http://schemas.microsoft.com/office/word/2010/wordprocessingDrawing" xmlns:wp="http://schemas.openxmlformats.org/drawingml/2006/wordprocessingDrawing" xmlns:w10="urn:schemas-microsoft-com:office:word" xmlns:w="http://schemas.openxmlformats.org/wordprocessingml/2006/main" xmlns:w14="http://schemas.microsoft.com/office/word/2010/wordml" xmlns:w15="http://schemas.microsoft.com/office/word/2012/wordml" xmlns:w16cex="http://schemas.microsoft.com/office/word/2018/wordml/cex" xmlns:w16cid="http://schemas.microsoft.com/office/word/2016/wordml/cid" xmlns:w16="http://schemas.microsoft.com/office/word/2018/wordml" xmlns:w16se="http://schemas.microsoft.com/office/word/2015/wordml/symex" xmlns:wpg="http://schemas.microsoft.com/office/word/2010/wordprocessingGroup" xmlns:wpi="http://schemas.microsoft.com/office/word/2010/wordprocessingInk" xmlns:wne="http://schemas.microsoft.com/office/word/2006/wordml" xmlns:wps="http://schemas.microsoft.com/office/word/2010/wordprocessingShape" mc:Ignorable="w14 w15 w16se w16cid w16 w16cex wp14">
   <w:endnote w:type="separator" w:id="-1">
     <w:p>
       <w:r>
@@ -4798,7 +4740,7 @@
 </file>
 
 <file path=word/footer1.xml><?xml version="1.0" encoding="utf-8"?>
-<w:ftr xmlns:wpc="http://schemas.microsoft.com/office/word/2010/wordprocessingCanvas" xmlns:cx="http://schemas.microsoft.com/office/drawing/2014/chartex" xmlns:cx1="http://schemas.microsoft.com/office/drawing/2015/9/8/chartex" xmlns:cx2="http://schemas.microsoft.com/office/drawing/2015/10/21/chartex" xmlns:cx3="http://schemas.microsoft.com/office/drawing/2016/5/9/chartex" xmlns:cx4="http://schemas.microsoft.com/office/drawing/2016/5/10/chartex" xmlns:cx5="http://schemas.microsoft.com/office/drawing/2016/5/11/chartex" xmlns:cx6="http://schemas.microsoft.com/office/drawing/2016/5/12/chartex" xmlns:cx7="http://schemas.microsoft.com/office/drawing/2016/5/13/chartex" xmlns:cx8="http://schemas.microsoft.com/office/drawing/2016/5/14/chartex" xmlns:mc="http://schemas.openxmlformats.org/markup-compatibility/2006" xmlns:aink="http://schemas.microsoft.com/office/drawing/2016/ink" xmlns:am3d="http://schemas.microsoft.com/office/drawing/2017/model3d" xmlns:o="urn:schemas-microsoft-com:office:office" xmlns:oel="http://schemas.microsoft.com/office/2019/extlst" xmlns:r="http://schemas.openxmlformats.org/officeDocument/2006/relationships" xmlns:m="http://schemas.openxmlformats.org/officeDocument/2006/math" xmlns:v="urn:schemas-microsoft-com:vml" xmlns:wp14="http://schemas.microsoft.com/office/word/2010/wordprocessingDrawing" xmlns:wp="http://schemas.openxmlformats.org/drawingml/2006/wordprocessingDrawing" xmlns:w10="urn:schemas-microsoft-com:office:word" xmlns:w="http://schemas.openxmlformats.org/wordprocessingml/2006/main" xmlns:w14="http://schemas.microsoft.com/office/word/2010/wordml" xmlns:w15="http://schemas.microsoft.com/office/word/2012/wordml" xmlns:w16cex="http://schemas.microsoft.com/office/word/2018/wordml/cex" xmlns:w16cid="http://schemas.microsoft.com/office/word/2016/wordml/cid" xmlns:w16="http://schemas.microsoft.com/office/word/2018/wordml" xmlns:w16du="http://schemas.microsoft.com/office/word/2023/wordml/word16du" xmlns:w16sdtdh="http://schemas.microsoft.com/office/word/2020/wordml/sdtdatahash" xmlns:w16sdtfl="http://schemas.microsoft.com/office/word/2024/wordml/sdtformatlock" xmlns:w16se="http://schemas.microsoft.com/office/word/2015/wordml/symex" xmlns:wpg="http://schemas.microsoft.com/office/word/2010/wordprocessingGroup" xmlns:wpi="http://schemas.microsoft.com/office/word/2010/wordprocessingInk" xmlns:wne="http://schemas.microsoft.com/office/word/2006/wordml" xmlns:wps="http://schemas.microsoft.com/office/word/2010/wordprocessingShape" mc:Ignorable="w14 w15 w16se w16cid w16 w16cex w16sdtdh w16sdtfl w16du wp14">
+<w:ftr xmlns:wpc="http://schemas.microsoft.com/office/word/2010/wordprocessingCanvas" xmlns:cx="http://schemas.microsoft.com/office/drawing/2014/chartex" xmlns:cx1="http://schemas.microsoft.com/office/drawing/2015/9/8/chartex" xmlns:cx2="http://schemas.microsoft.com/office/drawing/2015/10/21/chartex" xmlns:cx3="http://schemas.microsoft.com/office/drawing/2016/5/9/chartex" xmlns:cx4="http://schemas.microsoft.com/office/drawing/2016/5/10/chartex" xmlns:cx5="http://schemas.microsoft.com/office/drawing/2016/5/11/chartex" xmlns:cx6="http://schemas.microsoft.com/office/drawing/2016/5/12/chartex" xmlns:cx7="http://schemas.microsoft.com/office/drawing/2016/5/13/chartex" xmlns:cx8="http://schemas.microsoft.com/office/drawing/2016/5/14/chartex" xmlns:mc="http://schemas.openxmlformats.org/markup-compatibility/2006" xmlns:aink="http://schemas.microsoft.com/office/drawing/2016/ink" xmlns:am3d="http://schemas.microsoft.com/office/drawing/2017/model3d" xmlns:o="urn:schemas-microsoft-com:office:office" xmlns:r="http://schemas.openxmlformats.org/officeDocument/2006/relationships" xmlns:m="http://schemas.openxmlformats.org/officeDocument/2006/math" xmlns:v="urn:schemas-microsoft-com:vml" xmlns:wp14="http://schemas.microsoft.com/office/word/2010/wordprocessingDrawing" xmlns:wp="http://schemas.openxmlformats.org/drawingml/2006/wordprocessingDrawing" xmlns:w10="urn:schemas-microsoft-com:office:word" xmlns:w="http://schemas.openxmlformats.org/wordprocessingml/2006/main" xmlns:w14="http://schemas.microsoft.com/office/word/2010/wordml" xmlns:w15="http://schemas.microsoft.com/office/word/2012/wordml" xmlns:w16cex="http://schemas.microsoft.com/office/word/2018/wordml/cex" xmlns:w16cid="http://schemas.microsoft.com/office/word/2016/wordml/cid" xmlns:w16="http://schemas.microsoft.com/office/word/2018/wordml" xmlns:w16se="http://schemas.microsoft.com/office/word/2015/wordml/symex" xmlns:wpg="http://schemas.microsoft.com/office/word/2010/wordprocessingGroup" xmlns:wpi="http://schemas.microsoft.com/office/word/2010/wordprocessingInk" xmlns:wne="http://schemas.microsoft.com/office/word/2006/wordml" xmlns:wps="http://schemas.microsoft.com/office/word/2010/wordprocessingShape" mc:Ignorable="w14 w15 w16se w16cid w16 w16cex wp14">
   <w:p>
     <w:pPr>
       <w:pStyle w:val="Footer"/>
@@ -4868,7 +4810,7 @@
 </file>
 
 <file path=word/footnotes.xml><?xml version="1.0" encoding="utf-8"?>
-<w:footnotes xmlns:wpc="http://schemas.microsoft.com/office/word/2010/wordprocessingCanvas" xmlns:cx="http://schemas.microsoft.com/office/drawing/2014/chartex" xmlns:cx1="http://schemas.microsoft.com/office/drawing/2015/9/8/chartex" xmlns:cx2="http://schemas.microsoft.com/office/drawing/2015/10/21/chartex" xmlns:cx3="http://schemas.microsoft.com/office/drawing/2016/5/9/chartex" xmlns:cx4="http://schemas.microsoft.com/office/drawing/2016/5/10/chartex" xmlns:cx5="http://schemas.microsoft.com/office/drawing/2016/5/11/chartex" xmlns:cx6="http://schemas.microsoft.com/office/drawing/2016/5/12/chartex" xmlns:cx7="http://schemas.microsoft.com/office/drawing/2016/5/13/chartex" xmlns:cx8="http://schemas.microsoft.com/office/drawing/2016/5/14/chartex" xmlns:mc="http://schemas.openxmlformats.org/markup-compatibility/2006" xmlns:aink="http://schemas.microsoft.com/office/drawing/2016/ink" xmlns:am3d="http://schemas.microsoft.com/office/drawing/2017/model3d" xmlns:o="urn:schemas-microsoft-com:office:office" xmlns:oel="http://schemas.microsoft.com/office/2019/extlst" xmlns:r="http://schemas.openxmlformats.org/officeDocument/2006/relationships" xmlns:m="http://schemas.openxmlformats.org/officeDocument/2006/math" xmlns:v="urn:schemas-microsoft-com:vml" xmlns:wp14="http://schemas.microsoft.com/office/word/2010/wordprocessingDrawing" xmlns:wp="http://schemas.openxmlformats.org/drawingml/2006/wordprocessingDrawing" xmlns:w10="urn:schemas-microsoft-com:office:word" xmlns:w="http://schemas.openxmlformats.org/wordprocessingml/2006/main" xmlns:w14="http://schemas.microsoft.com/office/word/2010/wordml" xmlns:w15="http://schemas.microsoft.com/office/word/2012/wordml" xmlns:w16cex="http://schemas.microsoft.com/office/word/2018/wordml/cex" xmlns:w16cid="http://schemas.microsoft.com/office/word/2016/wordml/cid" xmlns:w16="http://schemas.microsoft.com/office/word/2018/wordml" xmlns:w16du="http://schemas.microsoft.com/office/word/2023/wordml/word16du" xmlns:w16sdtdh="http://schemas.microsoft.com/office/word/2020/wordml/sdtdatahash" xmlns:w16sdtfl="http://schemas.microsoft.com/office/word/2024/wordml/sdtformatlock" xmlns:w16se="http://schemas.microsoft.com/office/word/2015/wordml/symex" xmlns:wpg="http://schemas.microsoft.com/office/word/2010/wordprocessingGroup" xmlns:wpi="http://schemas.microsoft.com/office/word/2010/wordprocessingInk" xmlns:wne="http://schemas.microsoft.com/office/word/2006/wordml" xmlns:wps="http://schemas.microsoft.com/office/word/2010/wordprocessingShape" mc:Ignorable="w14 w15 w16se w16cid w16 w16cex w16sdtdh w16sdtfl w16du wp14">
+<w:footnotes xmlns:wpc="http://schemas.microsoft.com/office/word/2010/wordprocessingCanvas" xmlns:cx="http://schemas.microsoft.com/office/drawing/2014/chartex" xmlns:cx1="http://schemas.microsoft.com/office/drawing/2015/9/8/chartex" xmlns:cx2="http://schemas.microsoft.com/office/drawing/2015/10/21/chartex" xmlns:cx3="http://schemas.microsoft.com/office/drawing/2016/5/9/chartex" xmlns:cx4="http://schemas.microsoft.com/office/drawing/2016/5/10/chartex" xmlns:cx5="http://schemas.microsoft.com/office/drawing/2016/5/11/chartex" xmlns:cx6="http://schemas.microsoft.com/office/drawing/2016/5/12/chartex" xmlns:cx7="http://schemas.microsoft.com/office/drawing/2016/5/13/chartex" xmlns:cx8="http://schemas.microsoft.com/office/drawing/2016/5/14/chartex" xmlns:mc="http://schemas.openxmlformats.org/markup-compatibility/2006" xmlns:aink="http://schemas.microsoft.com/office/drawing/2016/ink" xmlns:am3d="http://schemas.microsoft.com/office/drawing/2017/model3d" xmlns:o="urn:schemas-microsoft-com:office:office" xmlns:r="http://schemas.openxmlformats.org/officeDocument/2006/relationships" xmlns:m="http://schemas.openxmlformats.org/officeDocument/2006/math" xmlns:v="urn:schemas-microsoft-com:vml" xmlns:wp14="http://schemas.microsoft.com/office/word/2010/wordprocessingDrawing" xmlns:wp="http://schemas.openxmlformats.org/drawingml/2006/wordprocessingDrawing" xmlns:w10="urn:schemas-microsoft-com:office:word" xmlns:w="http://schemas.openxmlformats.org/wordprocessingml/2006/main" xmlns:w14="http://schemas.microsoft.com/office/word/2010/wordml" xmlns:w15="http://schemas.microsoft.com/office/word/2012/wordml" xmlns:w16cex="http://schemas.microsoft.com/office/word/2018/wordml/cex" xmlns:w16cid="http://schemas.microsoft.com/office/word/2016/wordml/cid" xmlns:w16="http://schemas.microsoft.com/office/word/2018/wordml" xmlns:w16se="http://schemas.microsoft.com/office/word/2015/wordml/symex" xmlns:wpg="http://schemas.microsoft.com/office/word/2010/wordprocessingGroup" xmlns:wpi="http://schemas.microsoft.com/office/word/2010/wordprocessingInk" xmlns:wne="http://schemas.microsoft.com/office/word/2006/wordml" xmlns:wps="http://schemas.microsoft.com/office/word/2010/wordprocessingShape" mc:Ignorable="w14 w15 w16se w16cid w16 w16cex wp14">
   <w:footnote w:type="separator" w:id="-1">
     <w:p>
       <w:r>
@@ -4887,7 +4829,7 @@
 </file>
 
 <file path=word/header1.xml><?xml version="1.0" encoding="utf-8"?>
-<w:hdr xmlns:wpc="http://schemas.microsoft.com/office/word/2010/wordprocessingCanvas" xmlns:cx="http://schemas.microsoft.com/office/drawing/2014/chartex" xmlns:cx1="http://schemas.microsoft.com/office/drawing/2015/9/8/chartex" xmlns:cx2="http://schemas.microsoft.com/office/drawing/2015/10/21/chartex" xmlns:cx3="http://schemas.microsoft.com/office/drawing/2016/5/9/chartex" xmlns:cx4="http://schemas.microsoft.com/office/drawing/2016/5/10/chartex" xmlns:cx5="http://schemas.microsoft.com/office/drawing/2016/5/11/chartex" xmlns:cx6="http://schemas.microsoft.com/office/drawing/2016/5/12/chartex" xmlns:cx7="http://schemas.microsoft.com/office/drawing/2016/5/13/chartex" xmlns:cx8="http://schemas.microsoft.com/office/drawing/2016/5/14/chartex" xmlns:mc="http://schemas.openxmlformats.org/markup-compatibility/2006" xmlns:aink="http://schemas.microsoft.com/office/drawing/2016/ink" xmlns:am3d="http://schemas.microsoft.com/office/drawing/2017/model3d" xmlns:o="urn:schemas-microsoft-com:office:office" xmlns:oel="http://schemas.microsoft.com/office/2019/extlst" xmlns:r="http://schemas.openxmlformats.org/officeDocument/2006/relationships" xmlns:m="http://schemas.openxmlformats.org/officeDocument/2006/math" xmlns:v="urn:schemas-microsoft-com:vml" xmlns:wp14="http://schemas.microsoft.com/office/word/2010/wordprocessingDrawing" xmlns:wp="http://schemas.openxmlformats.org/drawingml/2006/wordprocessingDrawing" xmlns:w10="urn:schemas-microsoft-com:office:word" xmlns:w="http://schemas.openxmlformats.org/wordprocessingml/2006/main" xmlns:w14="http://schemas.microsoft.com/office/word/2010/wordml" xmlns:w15="http://schemas.microsoft.com/office/word/2012/wordml" xmlns:w16cex="http://schemas.microsoft.com/office/word/2018/wordml/cex" xmlns:w16cid="http://schemas.microsoft.com/office/word/2016/wordml/cid" xmlns:w16="http://schemas.microsoft.com/office/word/2018/wordml" xmlns:w16du="http://schemas.microsoft.com/office/word/2023/wordml/word16du" xmlns:w16sdtdh="http://schemas.microsoft.com/office/word/2020/wordml/sdtdatahash" xmlns:w16sdtfl="http://schemas.microsoft.com/office/word/2024/wordml/sdtformatlock" xmlns:w16se="http://schemas.microsoft.com/office/word/2015/wordml/symex" xmlns:wpg="http://schemas.microsoft.com/office/word/2010/wordprocessingGroup" xmlns:wpi="http://schemas.microsoft.com/office/word/2010/wordprocessingInk" xmlns:wne="http://schemas.microsoft.com/office/word/2006/wordml" xmlns:wps="http://schemas.microsoft.com/office/word/2010/wordprocessingShape" mc:Ignorable="w14 w15 w16se w16cid w16 w16cex w16sdtdh w16sdtfl w16du wp14">
+<w:hdr xmlns:wpc="http://schemas.microsoft.com/office/word/2010/wordprocessingCanvas" xmlns:cx="http://schemas.microsoft.com/office/drawing/2014/chartex" xmlns:cx1="http://schemas.microsoft.com/office/drawing/2015/9/8/chartex" xmlns:cx2="http://schemas.microsoft.com/office/drawing/2015/10/21/chartex" xmlns:cx3="http://schemas.microsoft.com/office/drawing/2016/5/9/chartex" xmlns:cx4="http://schemas.microsoft.com/office/drawing/2016/5/10/chartex" xmlns:cx5="http://schemas.microsoft.com/office/drawing/2016/5/11/chartex" xmlns:cx6="http://schemas.microsoft.com/office/drawing/2016/5/12/chartex" xmlns:cx7="http://schemas.microsoft.com/office/drawing/2016/5/13/chartex" xmlns:cx8="http://schemas.microsoft.com/office/drawing/2016/5/14/chartex" xmlns:mc="http://schemas.openxmlformats.org/markup-compatibility/2006" xmlns:aink="http://schemas.microsoft.com/office/drawing/2016/ink" xmlns:am3d="http://schemas.microsoft.com/office/drawing/2017/model3d" xmlns:o="urn:schemas-microsoft-com:office:office" xmlns:r="http://schemas.openxmlformats.org/officeDocument/2006/relationships" xmlns:m="http://schemas.openxmlformats.org/officeDocument/2006/math" xmlns:v="urn:schemas-microsoft-com:vml" xmlns:wp14="http://schemas.microsoft.com/office/word/2010/wordprocessingDrawing" xmlns:wp="http://schemas.openxmlformats.org/drawingml/2006/wordprocessingDrawing" xmlns:w10="urn:schemas-microsoft-com:office:word" xmlns:w="http://schemas.openxmlformats.org/wordprocessingml/2006/main" xmlns:w14="http://schemas.microsoft.com/office/word/2010/wordml" xmlns:w15="http://schemas.microsoft.com/office/word/2012/wordml" xmlns:w16cex="http://schemas.microsoft.com/office/word/2018/wordml/cex" xmlns:w16cid="http://schemas.microsoft.com/office/word/2016/wordml/cid" xmlns:w16="http://schemas.microsoft.com/office/word/2018/wordml" xmlns:w16se="http://schemas.microsoft.com/office/word/2015/wordml/symex" xmlns:wpg="http://schemas.microsoft.com/office/word/2010/wordprocessingGroup" xmlns:wpi="http://schemas.microsoft.com/office/word/2010/wordprocessingInk" xmlns:wne="http://schemas.microsoft.com/office/word/2006/wordml" xmlns:wps="http://schemas.microsoft.com/office/word/2010/wordprocessingShape" mc:Ignorable="w14 w15 w16se w16cid w16 w16cex wp14">
   <w:p>
     <w:pPr>
       <w:pStyle w:val="Header"/>
@@ -4957,7 +4899,7 @@
 </file>
 
 <file path=word/numbering.xml><?xml version="1.0" encoding="utf-8"?>
-<w:numbering xmlns:wpc="http://schemas.microsoft.com/office/word/2010/wordprocessingCanvas" xmlns:cx="http://schemas.microsoft.com/office/drawing/2014/chartex" xmlns:cx1="http://schemas.microsoft.com/office/drawing/2015/9/8/chartex" xmlns:cx2="http://schemas.microsoft.com/office/drawing/2015/10/21/chartex" xmlns:cx3="http://schemas.microsoft.com/office/drawing/2016/5/9/chartex" xmlns:cx4="http://schemas.microsoft.com/office/drawing/2016/5/10/chartex" xmlns:cx5="http://schemas.microsoft.com/office/drawing/2016/5/11/chartex" xmlns:cx6="http://schemas.microsoft.com/office/drawing/2016/5/12/chartex" xmlns:cx7="http://schemas.microsoft.com/office/drawing/2016/5/13/chartex" xmlns:cx8="http://schemas.microsoft.com/office/drawing/2016/5/14/chartex" xmlns:mc="http://schemas.openxmlformats.org/markup-compatibility/2006" xmlns:aink="http://schemas.microsoft.com/office/drawing/2016/ink" xmlns:am3d="http://schemas.microsoft.com/office/drawing/2017/model3d" xmlns:o="urn:schemas-microsoft-com:office:office" xmlns:oel="http://schemas.microsoft.com/office/2019/extlst" xmlns:r="http://schemas.openxmlformats.org/officeDocument/2006/relationships" xmlns:m="http://schemas.openxmlformats.org/officeDocument/2006/math" xmlns:v="urn:schemas-microsoft-com:vml" xmlns:wp14="http://schemas.microsoft.com/office/word/2010/wordprocessingDrawing" xmlns:wp="http://schemas.openxmlformats.org/drawingml/2006/wordprocessingDrawing" xmlns:w10="urn:schemas-microsoft-com:office:word" xmlns:w="http://schemas.openxmlformats.org/wordprocessingml/2006/main" xmlns:w14="http://schemas.microsoft.com/office/word/2010/wordml" xmlns:w15="http://schemas.microsoft.com/office/word/2012/wordml" xmlns:w16cex="http://schemas.microsoft.com/office/word/2018/wordml/cex" xmlns:w16cid="http://schemas.microsoft.com/office/word/2016/wordml/cid" xmlns:w16="http://schemas.microsoft.com/office/word/2018/wordml" xmlns:w16du="http://schemas.microsoft.com/office/word/2023/wordml/word16du" xmlns:w16sdtdh="http://schemas.microsoft.com/office/word/2020/wordml/sdtdatahash" xmlns:w16sdtfl="http://schemas.microsoft.com/office/word/2024/wordml/sdtformatlock" xmlns:w16se="http://schemas.microsoft.com/office/word/2015/wordml/symex" xmlns:wpg="http://schemas.microsoft.com/office/word/2010/wordprocessingGroup" xmlns:wpi="http://schemas.microsoft.com/office/word/2010/wordprocessingInk" xmlns:wne="http://schemas.microsoft.com/office/word/2006/wordml" xmlns:wps="http://schemas.microsoft.com/office/word/2010/wordprocessingShape" mc:Ignorable="w14 w15 w16se w16cid w16 w16cex w16sdtdh w16sdtfl w16du wp14">
+<w:numbering xmlns:wpc="http://schemas.microsoft.com/office/word/2010/wordprocessingCanvas" xmlns:cx="http://schemas.microsoft.com/office/drawing/2014/chartex" xmlns:cx1="http://schemas.microsoft.com/office/drawing/2015/9/8/chartex" xmlns:cx2="http://schemas.microsoft.com/office/drawing/2015/10/21/chartex" xmlns:cx3="http://schemas.microsoft.com/office/drawing/2016/5/9/chartex" xmlns:cx4="http://schemas.microsoft.com/office/drawing/2016/5/10/chartex" xmlns:cx5="http://schemas.microsoft.com/office/drawing/2016/5/11/chartex" xmlns:cx6="http://schemas.microsoft.com/office/drawing/2016/5/12/chartex" xmlns:cx7="http://schemas.microsoft.com/office/drawing/2016/5/13/chartex" xmlns:cx8="http://schemas.microsoft.com/office/drawing/2016/5/14/chartex" xmlns:mc="http://schemas.openxmlformats.org/markup-compatibility/2006" xmlns:aink="http://schemas.microsoft.com/office/drawing/2016/ink" xmlns:am3d="http://schemas.microsoft.com/office/drawing/2017/model3d" xmlns:o="urn:schemas-microsoft-com:office:office" xmlns:r="http://schemas.openxmlformats.org/officeDocument/2006/relationships" xmlns:m="http://schemas.openxmlformats.org/officeDocument/2006/math" xmlns:v="urn:schemas-microsoft-com:vml" xmlns:wp14="http://schemas.microsoft.com/office/word/2010/wordprocessingDrawing" xmlns:wp="http://schemas.openxmlformats.org/drawingml/2006/wordprocessingDrawing" xmlns:w10="urn:schemas-microsoft-com:office:word" xmlns:w="http://schemas.openxmlformats.org/wordprocessingml/2006/main" xmlns:w14="http://schemas.microsoft.com/office/word/2010/wordml" xmlns:w15="http://schemas.microsoft.com/office/word/2012/wordml" xmlns:w16cex="http://schemas.microsoft.com/office/word/2018/wordml/cex" xmlns:w16cid="http://schemas.microsoft.com/office/word/2016/wordml/cid" xmlns:w16="http://schemas.microsoft.com/office/word/2018/wordml" xmlns:w16se="http://schemas.microsoft.com/office/word/2015/wordml/symex" xmlns:wpg="http://schemas.microsoft.com/office/word/2010/wordprocessingGroup" xmlns:wpi="http://schemas.microsoft.com/office/word/2010/wordprocessingInk" xmlns:wne="http://schemas.microsoft.com/office/word/2006/wordml" xmlns:wps="http://schemas.microsoft.com/office/word/2010/wordprocessingShape" mc:Ignorable="w14 w15 w16se w16cid w16 w16cex wp14">
   <w:abstractNum w:abstractNumId="0" w15:restartNumberingAfterBreak="0">
     <w:nsid w:val="18F11A06"/>
     <w:multiLevelType w:val="hybridMultilevel"/>
@@ -5914,13 +5856,13 @@
       </w:pPr>
     </w:lvl>
   </w:abstractNum>
-  <w:num w:numId="1" w16cid:durableId="418598182">
+  <w:num w:numId="1">
     <w:abstractNumId w:val="8"/>
   </w:num>
-  <w:num w:numId="2" w16cid:durableId="1543784680">
+  <w:num w:numId="2">
     <w:abstractNumId w:val="1"/>
   </w:num>
-  <w:num w:numId="3" w16cid:durableId="1736515124">
+  <w:num w:numId="3">
     <w:abstractNumId w:val="7"/>
     <w:lvlOverride w:ilvl="0">
       <w:startOverride w:val="1"/>
@@ -5950,7 +5892,7 @@
       <w:startOverride w:val="1"/>
     </w:lvlOverride>
   </w:num>
-  <w:num w:numId="4" w16cid:durableId="745154182">
+  <w:num w:numId="4">
     <w:abstractNumId w:val="4"/>
     <w:lvlOverride w:ilvl="0">
       <w:startOverride w:val="1"/>
@@ -5980,22 +5922,22 @@
       <w:startOverride w:val="1"/>
     </w:lvlOverride>
   </w:num>
-  <w:num w:numId="5" w16cid:durableId="629215591">
+  <w:num w:numId="5">
     <w:abstractNumId w:val="6"/>
   </w:num>
-  <w:num w:numId="6" w16cid:durableId="722944466">
+  <w:num w:numId="6">
     <w:abstractNumId w:val="5"/>
   </w:num>
-  <w:num w:numId="7" w16cid:durableId="2104715970">
+  <w:num w:numId="7">
     <w:abstractNumId w:val="2"/>
   </w:num>
-  <w:num w:numId="8" w16cid:durableId="1210875752">
+  <w:num w:numId="8">
     <w:abstractNumId w:val="3"/>
   </w:num>
-  <w:num w:numId="9" w16cid:durableId="845905161">
+  <w:num w:numId="9">
     <w:abstractNumId w:val="0"/>
   </w:num>
-  <w:num w:numId="10" w16cid:durableId="46876343">
+  <w:num w:numId="10">
     <w:abstractNumId w:val="3"/>
     <w:lvlOverride w:ilvl="0">
       <w:startOverride w:val="1"/>
@@ -6025,14 +5967,14 @@
       <w:startOverride w:val="1"/>
     </w:lvlOverride>
   </w:num>
-  <w:num w:numId="11" w16cid:durableId="1795099768">
+  <w:num w:numId="11">
     <w:abstractNumId w:val="3"/>
   </w:num>
 </w:numbering>
 </file>
 
 <file path=word/styles.xml><?xml version="1.0" encoding="utf-8"?>
-<w:styles xmlns:mc="http://schemas.openxmlformats.org/markup-compatibility/2006" xmlns:r="http://schemas.openxmlformats.org/officeDocument/2006/relationships" xmlns:w="http://schemas.openxmlformats.org/wordprocessingml/2006/main" xmlns:w14="http://schemas.microsoft.com/office/word/2010/wordml" xmlns:w15="http://schemas.microsoft.com/office/word/2012/wordml" xmlns:w16cex="http://schemas.microsoft.com/office/word/2018/wordml/cex" xmlns:w16cid="http://schemas.microsoft.com/office/word/2016/wordml/cid" xmlns:w16="http://schemas.microsoft.com/office/word/2018/wordml" xmlns:w16du="http://schemas.microsoft.com/office/word/2023/wordml/word16du" xmlns:w16sdtdh="http://schemas.microsoft.com/office/word/2020/wordml/sdtdatahash" xmlns:w16sdtfl="http://schemas.microsoft.com/office/word/2024/wordml/sdtformatlock" xmlns:w16se="http://schemas.microsoft.com/office/word/2015/wordml/symex" mc:Ignorable="w14 w15 w16se w16cid w16 w16cex w16sdtdh w16sdtfl w16du">
+<w:styles xmlns:mc="http://schemas.openxmlformats.org/markup-compatibility/2006" xmlns:r="http://schemas.openxmlformats.org/officeDocument/2006/relationships" xmlns:w="http://schemas.openxmlformats.org/wordprocessingml/2006/main" xmlns:w14="http://schemas.microsoft.com/office/word/2010/wordml" xmlns:w15="http://schemas.microsoft.com/office/word/2012/wordml" xmlns:w16cex="http://schemas.microsoft.com/office/word/2018/wordml/cex" xmlns:w16cid="http://schemas.microsoft.com/office/word/2016/wordml/cid" xmlns:w16="http://schemas.microsoft.com/office/word/2018/wordml" xmlns:w16se="http://schemas.microsoft.com/office/word/2015/wordml/symex" mc:Ignorable="w14 w15 w16se w16cid w16 w16cex">
   <w:docDefaults>
     <w:rPrDefault>
       <w:rPr>

</xml_diff>